<commit_message>
feat: ASSINATURAS SÃO BUSCADAS AUTOMATICAMENTE
</commit_message>
<xml_diff>
--- a/relatorios_semob/src/main/resources/templates/template_relatorio.docx
+++ b/relatorios_semob/src/main/resources/templates/template_relatorio.docx
@@ -38,8 +38,8 @@
         <w:gridCol w:w="138"/>
         <w:gridCol w:w="1102"/>
         <w:gridCol w:w="1846"/>
-        <w:gridCol w:w="86"/>
-        <w:gridCol w:w="2999"/>
+        <w:gridCol w:w="85"/>
+        <w:gridCol w:w="3000"/>
         <w:gridCol w:w="403"/>
         <w:gridCol w:w="1413"/>
         <w:gridCol w:w="1474"/>
@@ -528,7 +528,7 @@
         </w:tc>
         <w:tc>
           <w:tcPr>
-            <w:tcW w:w="86" w:type="dxa"/>
+            <w:tcW w:w="85" w:type="dxa"/>
             <w:vMerge w:val="restart"/>
             <w:tcBorders>
               <w:top w:val="single" w:sz="4" w:space="0" w:color="000000"/>
@@ -563,7 +563,7 @@
         </w:tc>
         <w:tc>
           <w:tcPr>
-            <w:tcW w:w="2999" w:type="dxa"/>
+            <w:tcW w:w="3000" w:type="dxa"/>
             <w:tcBorders>
               <w:top w:val="single" w:sz="4" w:space="0" w:color="000000"/>
               <w:left w:val="single" w:sz="4" w:space="0" w:color="000000"/>
@@ -811,7 +811,7 @@
         </w:tc>
         <w:tc>
           <w:tcPr>
-            <w:tcW w:w="86" w:type="dxa"/>
+            <w:tcW w:w="85" w:type="dxa"/>
             <w:vMerge w:val="continue"/>
             <w:tcBorders>
               <w:left w:val="single" w:sz="4" w:space="0" w:color="000000"/>
@@ -843,7 +843,7 @@
         </w:tc>
         <w:tc>
           <w:tcPr>
-            <w:tcW w:w="2999" w:type="dxa"/>
+            <w:tcW w:w="3000" w:type="dxa"/>
             <w:vMerge w:val="restart"/>
             <w:tcBorders>
               <w:top w:val="single" w:sz="4" w:space="0" w:color="000000"/>
@@ -1147,7 +1147,7 @@
         </w:tc>
         <w:tc>
           <w:tcPr>
-            <w:tcW w:w="86" w:type="dxa"/>
+            <w:tcW w:w="85" w:type="dxa"/>
             <w:vMerge w:val="continue"/>
             <w:tcBorders>
               <w:left w:val="single" w:sz="4" w:space="0" w:color="000000"/>
@@ -1179,7 +1179,7 @@
         </w:tc>
         <w:tc>
           <w:tcPr>
-            <w:tcW w:w="2999" w:type="dxa"/>
+            <w:tcW w:w="3000" w:type="dxa"/>
             <w:vMerge w:val="continue"/>
             <w:tcBorders>
               <w:top w:val="single" w:sz="4" w:space="0" w:color="000000"/>
@@ -1495,9 +1495,9 @@
                                   <a:avLst/>
                                   <a:gdLst>
                                     <a:gd name="textAreaLeft" fmla="*/ 0 w 16920"/>
-                                    <a:gd name="textAreaRight" fmla="*/ 20880 w 16920"/>
+                                    <a:gd name="textAreaRight" fmla="*/ 21240 w 16920"/>
                                     <a:gd name="textAreaTop" fmla="*/ 0 h 5040"/>
-                                    <a:gd name="textAreaBottom" fmla="*/ 9000 h 5040"/>
+                                    <a:gd name="textAreaBottom" fmla="*/ 9360 h 5040"/>
                                   </a:gdLst>
                                   <a:ahLst/>
                                   <a:cxnLst/>
@@ -1833,48 +1833,8 @@
     <w:p>
       <w:pPr>
         <w:pStyle w:val="BodyText"/>
-        <w:spacing w:before="240" w:after="0"/>
-        <w:rPr/>
-      </w:pPr>
-      <w:r>
-        <w:rPr/>
-      </w:r>
-    </w:p>
-    <w:p>
-      <w:pPr>
-        <w:pStyle w:val="BodyText"/>
-        <w:spacing w:before="240" w:after="0"/>
-        <w:rPr/>
-      </w:pPr>
-      <w:r>
-        <w:rPr/>
-      </w:r>
-    </w:p>
-    <w:p>
-      <w:pPr>
-        <w:pStyle w:val="BodyText"/>
-        <w:spacing w:before="240" w:after="0"/>
-        <w:rPr/>
-      </w:pPr>
-      <w:r>
-        <w:rPr/>
-      </w:r>
-    </w:p>
-    <w:p>
-      <w:pPr>
-        <w:pStyle w:val="BodyText"/>
-        <w:spacing w:before="240" w:after="0"/>
-        <w:rPr/>
-      </w:pPr>
-      <w:r>
-        <w:rPr/>
-      </w:r>
-    </w:p>
-    <w:p>
-      <w:pPr>
-        <w:pStyle w:val="BodyText"/>
         <w:spacing w:before="221" w:after="0"/>
-        <w:ind w:left="144" w:right="2"/>
+        <w:ind w:hanging="0" w:left="0" w:right="2"/>
         <w:jc w:val="center"/>
         <w:rPr>
           <w:b w:val="false"/>
@@ -1882,140 +1842,137 @@
         </w:rPr>
       </w:pPr>
       <w:r>
-        <w:rPr/>
-        <mc:AlternateContent>
-          <mc:Choice Requires="wpg">
-            <w:drawing>
-              <wp:anchor distT="635" distB="0" distL="0" distR="0" simplePos="0" relativeHeight="4" behindDoc="1" locked="0" layoutInCell="0" allowOverlap="1">
-                <wp:simplePos x="0" y="0"/>
-                <wp:positionH relativeFrom="page">
-                  <wp:posOffset>2245360</wp:posOffset>
-                </wp:positionH>
-                <wp:positionV relativeFrom="paragraph">
-                  <wp:posOffset>186055</wp:posOffset>
-                </wp:positionV>
-                <wp:extent cx="3161665" cy="581025"/>
-                <wp:effectExtent l="0" t="0" r="0" b="0"/>
-                <wp:wrapTopAndBottom/>
-                <wp:docPr id="4" name="Group 4"/>
-                <a:graphic xmlns:a="http://schemas.openxmlformats.org/drawingml/2006/main">
-                  <a:graphicData uri="http://schemas.microsoft.com/office/word/2010/wordprocessingGroup">
-                    <wpg:wgp>
-                      <wpg:cNvGrpSpPr/>
-                      <wpg:grpSpPr>
-                        <a:xfrm>
-                          <a:off x="0" y="0"/>
-                          <a:ext cx="3161520" cy="581040"/>
-                          <a:chOff x="0" y="0"/>
-                          <a:chExt cx="3161520" cy="581040"/>
-                        </a:xfrm>
-                      </wpg:grpSpPr>
-                      <wps:wsp>
-                        <wps:cNvPr id="5" name="Graphic 2"/>
-                        <wps:cNvSpPr/>
-                        <wps:spPr>
-                          <a:xfrm>
-                            <a:off x="0" y="544320"/>
-                            <a:ext cx="3161520" cy="720"/>
-                          </a:xfrm>
-                          <a:custGeom>
-                            <a:avLst/>
-                            <a:gdLst>
-                              <a:gd name="textAreaLeft" fmla="*/ 0 w 1792440"/>
-                              <a:gd name="textAreaRight" fmla="*/ 1792800 w 1792440"/>
-                              <a:gd name="textAreaTop" fmla="*/ 0 h 360"/>
-                              <a:gd name="textAreaBottom" fmla="*/ 720 h 360"/>
-                            </a:gdLst>
-                            <a:ahLst/>
-                            <a:cxnLst/>
-                            <a:rect l="textAreaLeft" t="textAreaTop" r="textAreaRight" b="textAreaBottom"/>
-                            <a:pathLst>
-                              <a:path w="3161665" h="0">
-                                <a:moveTo>
-                                  <a:pt x="0" y="0"/>
-                                </a:moveTo>
-                                <a:lnTo>
-                                  <a:pt x="3161665" y="0"/>
-                                </a:lnTo>
-                              </a:path>
-                            </a:pathLst>
-                          </a:custGeom>
-                          <a:noFill/>
-                          <a:ln w="11430">
-                            <a:solidFill>
-                              <a:srgbClr val="000000"/>
-                            </a:solidFill>
-                            <a:round/>
-                          </a:ln>
-                        </wps:spPr>
-                        <wps:style>
-                          <a:lnRef idx="0"/>
-                          <a:fillRef idx="0"/>
-                          <a:effectRef idx="0"/>
-                          <a:fontRef idx="minor"/>
-                        </wps:style>
-                        <wps:bodyPr/>
-                      </wps:wsp>
-                      <pic:pic xmlns:pic="http://schemas.openxmlformats.org/drawingml/2006/picture">
-                        <pic:nvPicPr>
-                          <pic:cNvPr id="6" name="Image 2"/>
-                          <pic:cNvPicPr/>
-                        </pic:nvPicPr>
-                        <pic:blipFill>
-                          <a:blip r:embed="rId3"/>
-                          <a:stretch/>
-                        </pic:blipFill>
-                        <pic:spPr>
-                          <a:xfrm>
-                            <a:off x="457200" y="0"/>
-                            <a:ext cx="2218680" cy="581040"/>
-                          </a:xfrm>
-                          <a:prstGeom prst="rect">
-                            <a:avLst/>
-                          </a:prstGeom>
-                          <a:noFill/>
-                          <a:ln w="0">
-                            <a:noFill/>
-                          </a:ln>
-                        </pic:spPr>
-                      </pic:pic>
-                    </wpg:wgp>
-                  </a:graphicData>
-                </a:graphic>
-              </wp:anchor>
-            </w:drawing>
-          </mc:Choice>
-          <mc:Fallback>
-            <w:pict>
-              <v:group id="shape_0" alt="Group 4" style="position:absolute;margin-left:176.8pt;margin-top:14.65pt;width:248.95pt;height:45.75pt" coordorigin="3536,293" coordsize="4979,915">
-                <v:shapetype id="_x0000_t75" coordsize="21600,21600" o:spt="75" o:preferrelative="t" path="m@4@5l@4@11@9@11@9@5xe" filled="f" stroked="f">
-                  <v:stroke joinstyle="miter"/>
-                  <v:formulas>
-                    <v:f eqn="if lineDrawn pixelLineWidth 0"/>
-                    <v:f eqn="sum @0 1 0"/>
-                    <v:f eqn="sum 0 0 @1"/>
-                    <v:f eqn="prod @2 1 2"/>
-                    <v:f eqn="prod @3 21600 pixelWidth"/>
-                    <v:f eqn="prod @3 21600 pixelHeight"/>
-                    <v:f eqn="sum @0 0 1"/>
-                    <v:f eqn="prod @6 1 2"/>
-                    <v:f eqn="prod @7 21600 pixelWidth"/>
-                    <v:f eqn="sum @8 21600 0"/>
-                    <v:f eqn="prod @7 21600 pixelHeight"/>
-                    <v:f eqn="sum @10 21600 0"/>
-                  </v:formulas>
-                  <v:path o:extrusionok="f" gradientshapeok="t" o:connecttype="rect"/>
-                  <o:lock v:ext="edit" aspectratio="t"/>
-                </v:shapetype>
-                <v:shape id="shape_0" stroked="f" o:allowincell="f" style="position:absolute;left:4256;top:293;width:3493;height:914;mso-wrap-style:none;v-text-anchor:middle;mso-position-horizontal-relative:page" type="_x0000_t75">
-                  <v:imagedata r:id="rId4" o:detectmouseclick="t"/>
-                  <v:stroke color="#3465a4" joinstyle="round" endcap="flat"/>
-                  <w10:wrap type="topAndBottom"/>
-                </v:shape>
-              </v:group>
-            </w:pict>
-          </mc:Fallback>
-        </mc:AlternateContent>
+        <w:rPr>
+          <w:b w:val="false"/>
+          <w:bCs w:val="false"/>
+        </w:rPr>
+      </w:r>
+    </w:p>
+    <w:p>
+      <w:pPr>
+        <w:pStyle w:val="BodyText"/>
+        <w:spacing w:before="221" w:after="0"/>
+        <w:ind w:hanging="0" w:left="0" w:right="2"/>
+        <w:jc w:val="center"/>
+        <w:rPr>
+          <w:b w:val="false"/>
+          <w:bCs w:val="false"/>
+        </w:rPr>
+      </w:pPr>
+      <w:r>
+        <w:rPr>
+          <w:b w:val="false"/>
+          <w:bCs w:val="false"/>
+        </w:rPr>
+      </w:r>
+    </w:p>
+    <w:p>
+      <w:pPr>
+        <w:pStyle w:val="BodyText"/>
+        <w:spacing w:before="221" w:after="0"/>
+        <w:ind w:hanging="0" w:left="0" w:right="2"/>
+        <w:jc w:val="center"/>
+        <w:rPr>
+          <w:b w:val="false"/>
+          <w:bCs w:val="false"/>
+        </w:rPr>
+      </w:pPr>
+      <w:r>
+        <w:rPr>
+          <w:b w:val="false"/>
+          <w:bCs w:val="false"/>
+        </w:rPr>
+      </w:r>
+    </w:p>
+    <w:p>
+      <w:pPr>
+        <w:pStyle w:val="BodyText"/>
+        <w:spacing w:before="221" w:after="0"/>
+        <w:ind w:hanging="0" w:left="0" w:right="2"/>
+        <w:jc w:val="center"/>
+        <w:rPr>
+          <w:b w:val="false"/>
+          <w:bCs w:val="false"/>
+        </w:rPr>
+      </w:pPr>
+      <w:r>
+        <w:rPr>
+          <w:b w:val="false"/>
+          <w:bCs w:val="false"/>
+        </w:rPr>
+      </w:r>
+    </w:p>
+    <w:p>
+      <w:pPr>
+        <w:pStyle w:val="BodyText"/>
+        <w:spacing w:before="221" w:after="0"/>
+        <w:ind w:hanging="0" w:left="0" w:right="2"/>
+        <w:jc w:val="center"/>
+        <w:rPr>
+          <w:b w:val="false"/>
+          <w:bCs w:val="false"/>
+        </w:rPr>
+      </w:pPr>
+      <w:r>
+        <w:rPr>
+          <w:b w:val="false"/>
+          <w:bCs w:val="false"/>
+        </w:rPr>
+      </w:r>
+    </w:p>
+    <w:p>
+      <w:pPr>
+        <w:pStyle w:val="BodyText"/>
+        <w:spacing w:before="221" w:after="0"/>
+        <w:ind w:hanging="0" w:left="0" w:right="2"/>
+        <w:jc w:val="center"/>
+        <w:rPr>
+          <w:b w:val="false"/>
+          <w:bCs w:val="false"/>
+        </w:rPr>
+      </w:pPr>
+      <w:r>
+        <w:rPr>
+          <w:b w:val="false"/>
+          <w:bCs w:val="false"/>
+        </w:rPr>
+      </w:r>
+    </w:p>
+    <w:p>
+      <w:pPr>
+        <w:pStyle w:val="BodyText"/>
+        <w:spacing w:before="221" w:after="0"/>
+        <w:ind w:hanging="0" w:left="0" w:right="2"/>
+        <w:jc w:val="center"/>
+        <w:rPr>
+          <w:b w:val="false"/>
+          <w:bCs w:val="false"/>
+        </w:rPr>
+      </w:pPr>
+      <w:r>
+        <w:rPr>
+          <w:b w:val="false"/>
+          <w:bCs w:val="false"/>
+        </w:rPr>
+      </w:r>
+    </w:p>
+    <w:p>
+      <w:pPr>
+        <w:pStyle w:val="BodyText"/>
+        <w:spacing w:before="221" w:after="0"/>
+        <w:ind w:hanging="0" w:left="0" w:right="2"/>
+        <w:jc w:val="center"/>
+        <w:rPr>
+          <w:b w:val="false"/>
+          <w:bCs w:val="false"/>
+        </w:rPr>
+      </w:pPr>
+      <w:r>
+        <w:rPr>
+          <w:b w:val="false"/>
+          <w:bCs w:val="false"/>
+        </w:rPr>
+        <w:t>{{assinatura}}</w:t>
       </w:r>
     </w:p>
     <w:p>
@@ -2080,8 +2037,8 @@
         <w:gridCol w:w="1803"/>
         <w:gridCol w:w="2113"/>
         <w:gridCol w:w="100"/>
-        <w:gridCol w:w="1547"/>
-        <w:gridCol w:w="1594"/>
+        <w:gridCol w:w="1546"/>
+        <w:gridCol w:w="1595"/>
       </w:tblGrid>
       <w:tr>
         <w:trPr>
@@ -2936,7 +2893,7 @@
         </w:tc>
         <w:tc>
           <w:tcPr>
-            <w:tcW w:w="1547" w:type="dxa"/>
+            <w:tcW w:w="1546" w:type="dxa"/>
             <w:tcBorders>
               <w:top w:val="single" w:sz="4" w:space="0" w:color="000000"/>
               <w:left w:val="single" w:sz="4" w:space="0" w:color="000000"/>
@@ -2987,7 +2944,7 @@
         </w:tc>
         <w:tc>
           <w:tcPr>
-            <w:tcW w:w="1594" w:type="dxa"/>
+            <w:tcW w:w="1595" w:type="dxa"/>
             <w:tcBorders>
               <w:top w:val="single" w:sz="4" w:space="0" w:color="000000"/>
               <w:left w:val="single" w:sz="4" w:space="0" w:color="000000"/>
@@ -3418,7 +3375,7 @@
         </w:tc>
         <w:tc>
           <w:tcPr>
-            <w:tcW w:w="1547" w:type="dxa"/>
+            <w:tcW w:w="1546" w:type="dxa"/>
             <w:tcBorders>
               <w:top w:val="single" w:sz="4" w:space="0" w:color="000000"/>
               <w:left w:val="single" w:sz="4" w:space="0" w:color="000000"/>
@@ -3551,7 +3508,7 @@
         </w:tc>
         <w:tc>
           <w:tcPr>
-            <w:tcW w:w="1594" w:type="dxa"/>
+            <w:tcW w:w="1595" w:type="dxa"/>
             <w:tcBorders>
               <w:top w:val="single" w:sz="4" w:space="0" w:color="000000"/>
               <w:left w:val="single" w:sz="4" w:space="0" w:color="000000"/>
@@ -4039,7 +3996,7 @@
         </w:tc>
         <w:tc>
           <w:tcPr>
-            <w:tcW w:w="1547" w:type="dxa"/>
+            <w:tcW w:w="1546" w:type="dxa"/>
             <w:tcBorders>
               <w:top w:val="single" w:sz="4" w:space="0" w:color="000000"/>
               <w:left w:val="single" w:sz="4" w:space="0" w:color="000000"/>
@@ -4172,7 +4129,7 @@
         </w:tc>
         <w:tc>
           <w:tcPr>
-            <w:tcW w:w="1594" w:type="dxa"/>
+            <w:tcW w:w="1595" w:type="dxa"/>
             <w:tcBorders>
               <w:top w:val="single" w:sz="4" w:space="0" w:color="000000"/>
               <w:left w:val="single" w:sz="4" w:space="0" w:color="000000"/>
@@ -4660,7 +4617,7 @@
         </w:tc>
         <w:tc>
           <w:tcPr>
-            <w:tcW w:w="1547" w:type="dxa"/>
+            <w:tcW w:w="1546" w:type="dxa"/>
             <w:tcBorders>
               <w:top w:val="single" w:sz="4" w:space="0" w:color="000000"/>
               <w:left w:val="single" w:sz="4" w:space="0" w:color="000000"/>
@@ -4793,7 +4750,7 @@
         </w:tc>
         <w:tc>
           <w:tcPr>
-            <w:tcW w:w="1594" w:type="dxa"/>
+            <w:tcW w:w="1595" w:type="dxa"/>
             <w:tcBorders>
               <w:top w:val="single" w:sz="4" w:space="0" w:color="000000"/>
               <w:left w:val="single" w:sz="4" w:space="0" w:color="000000"/>
@@ -5281,7 +5238,7 @@
         </w:tc>
         <w:tc>
           <w:tcPr>
-            <w:tcW w:w="1547" w:type="dxa"/>
+            <w:tcW w:w="1546" w:type="dxa"/>
             <w:tcBorders>
               <w:top w:val="single" w:sz="4" w:space="0" w:color="000000"/>
               <w:left w:val="single" w:sz="4" w:space="0" w:color="000000"/>
@@ -5414,7 +5371,7 @@
         </w:tc>
         <w:tc>
           <w:tcPr>
-            <w:tcW w:w="1594" w:type="dxa"/>
+            <w:tcW w:w="1595" w:type="dxa"/>
             <w:tcBorders>
               <w:top w:val="single" w:sz="4" w:space="0" w:color="000000"/>
               <w:left w:val="single" w:sz="4" w:space="0" w:color="000000"/>
@@ -5902,7 +5859,7 @@
         </w:tc>
         <w:tc>
           <w:tcPr>
-            <w:tcW w:w="1547" w:type="dxa"/>
+            <w:tcW w:w="1546" w:type="dxa"/>
             <w:tcBorders>
               <w:top w:val="single" w:sz="4" w:space="0" w:color="000000"/>
               <w:left w:val="single" w:sz="4" w:space="0" w:color="000000"/>
@@ -6035,7 +5992,7 @@
         </w:tc>
         <w:tc>
           <w:tcPr>
-            <w:tcW w:w="1594" w:type="dxa"/>
+            <w:tcW w:w="1595" w:type="dxa"/>
             <w:tcBorders>
               <w:top w:val="single" w:sz="4" w:space="0" w:color="000000"/>
               <w:left w:val="single" w:sz="4" w:space="0" w:color="000000"/>
@@ -6506,7 +6463,7 @@
         </w:tc>
         <w:tc>
           <w:tcPr>
-            <w:tcW w:w="1547" w:type="dxa"/>
+            <w:tcW w:w="1546" w:type="dxa"/>
             <w:tcBorders>
               <w:top w:val="single" w:sz="4" w:space="0" w:color="000000"/>
               <w:left w:val="single" w:sz="4" w:space="0" w:color="000000"/>
@@ -6639,7 +6596,7 @@
         </w:tc>
         <w:tc>
           <w:tcPr>
-            <w:tcW w:w="1594" w:type="dxa"/>
+            <w:tcW w:w="1595" w:type="dxa"/>
             <w:tcBorders>
               <w:top w:val="single" w:sz="4" w:space="0" w:color="000000"/>
               <w:left w:val="single" w:sz="4" w:space="0" w:color="000000"/>
@@ -7135,7 +7092,7 @@
         </w:tc>
         <w:tc>
           <w:tcPr>
-            <w:tcW w:w="1547" w:type="dxa"/>
+            <w:tcW w:w="1546" w:type="dxa"/>
             <w:tcBorders>
               <w:top w:val="single" w:sz="4" w:space="0" w:color="000000"/>
               <w:left w:val="single" w:sz="4" w:space="0" w:color="000000"/>
@@ -7268,7 +7225,7 @@
         </w:tc>
         <w:tc>
           <w:tcPr>
-            <w:tcW w:w="1594" w:type="dxa"/>
+            <w:tcW w:w="1595" w:type="dxa"/>
             <w:tcBorders>
               <w:top w:val="single" w:sz="4" w:space="0" w:color="000000"/>
               <w:left w:val="single" w:sz="4" w:space="0" w:color="000000"/>
@@ -7756,7 +7713,7 @@
         </w:tc>
         <w:tc>
           <w:tcPr>
-            <w:tcW w:w="1547" w:type="dxa"/>
+            <w:tcW w:w="1546" w:type="dxa"/>
             <w:tcBorders>
               <w:top w:val="single" w:sz="4" w:space="0" w:color="000000"/>
               <w:left w:val="single" w:sz="4" w:space="0" w:color="000000"/>
@@ -7889,7 +7846,7 @@
         </w:tc>
         <w:tc>
           <w:tcPr>
-            <w:tcW w:w="1594" w:type="dxa"/>
+            <w:tcW w:w="1595" w:type="dxa"/>
             <w:tcBorders>
               <w:top w:val="single" w:sz="4" w:space="0" w:color="000000"/>
               <w:left w:val="single" w:sz="4" w:space="0" w:color="000000"/>
@@ -8377,7 +8334,7 @@
         </w:tc>
         <w:tc>
           <w:tcPr>
-            <w:tcW w:w="1547" w:type="dxa"/>
+            <w:tcW w:w="1546" w:type="dxa"/>
             <w:tcBorders>
               <w:top w:val="single" w:sz="4" w:space="0" w:color="000000"/>
               <w:left w:val="single" w:sz="4" w:space="0" w:color="000000"/>
@@ -8510,7 +8467,7 @@
         </w:tc>
         <w:tc>
           <w:tcPr>
-            <w:tcW w:w="1594" w:type="dxa"/>
+            <w:tcW w:w="1595" w:type="dxa"/>
             <w:tcBorders>
               <w:top w:val="single" w:sz="4" w:space="0" w:color="000000"/>
               <w:left w:val="single" w:sz="4" w:space="0" w:color="000000"/>
@@ -9032,7 +8989,7 @@
         </w:tc>
         <w:tc>
           <w:tcPr>
-            <w:tcW w:w="1547" w:type="dxa"/>
+            <w:tcW w:w="1546" w:type="dxa"/>
             <w:tcBorders>
               <w:top w:val="single" w:sz="4" w:space="0" w:color="000000"/>
               <w:left w:val="single" w:sz="4" w:space="0" w:color="000000"/>
@@ -9165,7 +9122,7 @@
         </w:tc>
         <w:tc>
           <w:tcPr>
-            <w:tcW w:w="1594" w:type="dxa"/>
+            <w:tcW w:w="1595" w:type="dxa"/>
             <w:tcBorders>
               <w:top w:val="single" w:sz="4" w:space="0" w:color="000000"/>
               <w:left w:val="single" w:sz="4" w:space="0" w:color="000000"/>
@@ -9636,7 +9593,7 @@
         </w:tc>
         <w:tc>
           <w:tcPr>
-            <w:tcW w:w="1547" w:type="dxa"/>
+            <w:tcW w:w="1546" w:type="dxa"/>
             <w:tcBorders>
               <w:top w:val="single" w:sz="4" w:space="0" w:color="000000"/>
               <w:left w:val="single" w:sz="4" w:space="0" w:color="000000"/>
@@ -9769,7 +9726,7 @@
         </w:tc>
         <w:tc>
           <w:tcPr>
-            <w:tcW w:w="1594" w:type="dxa"/>
+            <w:tcW w:w="1595" w:type="dxa"/>
             <w:tcBorders>
               <w:top w:val="single" w:sz="4" w:space="0" w:color="000000"/>
               <w:left w:val="single" w:sz="4" w:space="0" w:color="000000"/>
@@ -10257,7 +10214,7 @@
         </w:tc>
         <w:tc>
           <w:tcPr>
-            <w:tcW w:w="1547" w:type="dxa"/>
+            <w:tcW w:w="1546" w:type="dxa"/>
             <w:tcBorders>
               <w:top w:val="single" w:sz="4" w:space="0" w:color="000000"/>
               <w:left w:val="single" w:sz="4" w:space="0" w:color="000000"/>
@@ -10390,7 +10347,7 @@
         </w:tc>
         <w:tc>
           <w:tcPr>
-            <w:tcW w:w="1594" w:type="dxa"/>
+            <w:tcW w:w="1595" w:type="dxa"/>
             <w:tcBorders>
               <w:top w:val="single" w:sz="4" w:space="0" w:color="000000"/>
               <w:left w:val="single" w:sz="4" w:space="0" w:color="000000"/>
@@ -10886,7 +10843,7 @@
         </w:tc>
         <w:tc>
           <w:tcPr>
-            <w:tcW w:w="1547" w:type="dxa"/>
+            <w:tcW w:w="1546" w:type="dxa"/>
             <w:tcBorders>
               <w:top w:val="single" w:sz="4" w:space="0" w:color="000000"/>
               <w:left w:val="single" w:sz="4" w:space="0" w:color="000000"/>
@@ -11019,7 +10976,7 @@
         </w:tc>
         <w:tc>
           <w:tcPr>
-            <w:tcW w:w="1594" w:type="dxa"/>
+            <w:tcW w:w="1595" w:type="dxa"/>
             <w:tcBorders>
               <w:top w:val="single" w:sz="4" w:space="0" w:color="000000"/>
               <w:left w:val="single" w:sz="4" w:space="0" w:color="000000"/>
@@ -11490,7 +11447,7 @@
         </w:tc>
         <w:tc>
           <w:tcPr>
-            <w:tcW w:w="1547" w:type="dxa"/>
+            <w:tcW w:w="1546" w:type="dxa"/>
             <w:tcBorders>
               <w:top w:val="single" w:sz="4" w:space="0" w:color="000000"/>
               <w:left w:val="single" w:sz="4" w:space="0" w:color="000000"/>
@@ -11623,7 +11580,7 @@
         </w:tc>
         <w:tc>
           <w:tcPr>
-            <w:tcW w:w="1594" w:type="dxa"/>
+            <w:tcW w:w="1595" w:type="dxa"/>
             <w:tcBorders>
               <w:top w:val="single" w:sz="4" w:space="0" w:color="000000"/>
               <w:left w:val="single" w:sz="4" w:space="0" w:color="000000"/>
@@ -12111,7 +12068,7 @@
         </w:tc>
         <w:tc>
           <w:tcPr>
-            <w:tcW w:w="1547" w:type="dxa"/>
+            <w:tcW w:w="1546" w:type="dxa"/>
             <w:tcBorders>
               <w:top w:val="single" w:sz="4" w:space="0" w:color="000000"/>
               <w:left w:val="single" w:sz="4" w:space="0" w:color="000000"/>
@@ -12244,7 +12201,7 @@
         </w:tc>
         <w:tc>
           <w:tcPr>
-            <w:tcW w:w="1594" w:type="dxa"/>
+            <w:tcW w:w="1595" w:type="dxa"/>
             <w:tcBorders>
               <w:top w:val="single" w:sz="4" w:space="0" w:color="000000"/>
               <w:left w:val="single" w:sz="4" w:space="0" w:color="000000"/>
@@ -12821,8 +12778,8 @@
       <w:lang w:val="pt-PT" w:eastAsia="en-US" w:bidi="ar-SA"/>
     </w:rPr>
   </w:style>
-  <w:style w:type="paragraph" w:styleId="Contedodatabelauser">
-    <w:name w:val="Conteúdo da tabela (user)"/>
+  <w:style w:type="paragraph" w:styleId="Contedodatabela">
+    <w:name w:val="Conteúdo da tabela"/>
     <w:basedOn w:val="Normal"/>
     <w:qFormat/>
     <w:pPr>
@@ -12831,8 +12788,8 @@
     </w:pPr>
     <w:rPr/>
   </w:style>
-  <w:style w:type="numbering" w:styleId="Semlista" w:default="1">
-    <w:name w:val="Sem lista"/>
+  <w:style w:type="numbering" w:styleId="Semlistauser" w:default="1">
+    <w:name w:val="Sem lista (user)"/>
     <w:uiPriority w:val="99"/>
     <w:semiHidden/>
     <w:unhideWhenUsed/>

</xml_diff>

<commit_message>
feat: TEMPLATE DE RELATÓRIO AJUSTADO..
</commit_message>
<xml_diff>
--- a/relatorios_semob/src/main/resources/templates/template_relatorio.docx
+++ b/relatorios_semob/src/main/resources/templates/template_relatorio.docx
@@ -1495,9 +1495,9 @@
                                   <a:avLst/>
                                   <a:gdLst>
                                     <a:gd name="textAreaLeft" fmla="*/ 0 w 16920"/>
-                                    <a:gd name="textAreaRight" fmla="*/ 21240 w 16920"/>
+                                    <a:gd name="textAreaRight" fmla="*/ 21600 w 16920"/>
                                     <a:gd name="textAreaTop" fmla="*/ 0 h 5040"/>
-                                    <a:gd name="textAreaBottom" fmla="*/ 9360 h 5040"/>
+                                    <a:gd name="textAreaBottom" fmla="*/ 9720 h 5040"/>
                                   </a:gdLst>
                                   <a:ahLst/>
                                   <a:cxnLst/>
@@ -1828,78 +1828,6 @@
       </w:pPr>
       <w:r>
         <w:rPr/>
-      </w:r>
-    </w:p>
-    <w:p>
-      <w:pPr>
-        <w:pStyle w:val="BodyText"/>
-        <w:spacing w:before="221" w:after="0"/>
-        <w:ind w:hanging="0" w:left="0" w:right="2"/>
-        <w:jc w:val="center"/>
-        <w:rPr>
-          <w:b w:val="false"/>
-          <w:bCs w:val="false"/>
-        </w:rPr>
-      </w:pPr>
-      <w:r>
-        <w:rPr>
-          <w:b w:val="false"/>
-          <w:bCs w:val="false"/>
-        </w:rPr>
-      </w:r>
-    </w:p>
-    <w:p>
-      <w:pPr>
-        <w:pStyle w:val="BodyText"/>
-        <w:spacing w:before="221" w:after="0"/>
-        <w:ind w:hanging="0" w:left="0" w:right="2"/>
-        <w:jc w:val="center"/>
-        <w:rPr>
-          <w:b w:val="false"/>
-          <w:bCs w:val="false"/>
-        </w:rPr>
-      </w:pPr>
-      <w:r>
-        <w:rPr>
-          <w:b w:val="false"/>
-          <w:bCs w:val="false"/>
-        </w:rPr>
-      </w:r>
-    </w:p>
-    <w:p>
-      <w:pPr>
-        <w:pStyle w:val="BodyText"/>
-        <w:spacing w:before="221" w:after="0"/>
-        <w:ind w:hanging="0" w:left="0" w:right="2"/>
-        <w:jc w:val="center"/>
-        <w:rPr>
-          <w:b w:val="false"/>
-          <w:bCs w:val="false"/>
-        </w:rPr>
-      </w:pPr>
-      <w:r>
-        <w:rPr>
-          <w:b w:val="false"/>
-          <w:bCs w:val="false"/>
-        </w:rPr>
-      </w:r>
-    </w:p>
-    <w:p>
-      <w:pPr>
-        <w:pStyle w:val="BodyText"/>
-        <w:spacing w:before="221" w:after="0"/>
-        <w:ind w:hanging="0" w:left="0" w:right="2"/>
-        <w:jc w:val="center"/>
-        <w:rPr>
-          <w:b w:val="false"/>
-          <w:bCs w:val="false"/>
-        </w:rPr>
-      </w:pPr>
-      <w:r>
-        <w:rPr>
-          <w:b w:val="false"/>
-          <w:bCs w:val="false"/>
-        </w:rPr>
       </w:r>
     </w:p>
     <w:p>
@@ -2037,8 +1965,8 @@
         <w:gridCol w:w="1803"/>
         <w:gridCol w:w="2113"/>
         <w:gridCol w:w="100"/>
-        <w:gridCol w:w="1546"/>
-        <w:gridCol w:w="1595"/>
+        <w:gridCol w:w="1545"/>
+        <w:gridCol w:w="1596"/>
       </w:tblGrid>
       <w:tr>
         <w:trPr>
@@ -2893,7 +2821,7 @@
         </w:tc>
         <w:tc>
           <w:tcPr>
-            <w:tcW w:w="1546" w:type="dxa"/>
+            <w:tcW w:w="1545" w:type="dxa"/>
             <w:tcBorders>
               <w:top w:val="single" w:sz="4" w:space="0" w:color="000000"/>
               <w:left w:val="single" w:sz="4" w:space="0" w:color="000000"/>
@@ -2944,7 +2872,7 @@
         </w:tc>
         <w:tc>
           <w:tcPr>
-            <w:tcW w:w="1595" w:type="dxa"/>
+            <w:tcW w:w="1596" w:type="dxa"/>
             <w:tcBorders>
               <w:top w:val="single" w:sz="4" w:space="0" w:color="000000"/>
               <w:left w:val="single" w:sz="4" w:space="0" w:color="000000"/>
@@ -3375,7 +3303,7 @@
         </w:tc>
         <w:tc>
           <w:tcPr>
-            <w:tcW w:w="1546" w:type="dxa"/>
+            <w:tcW w:w="1545" w:type="dxa"/>
             <w:tcBorders>
               <w:top w:val="single" w:sz="4" w:space="0" w:color="000000"/>
               <w:left w:val="single" w:sz="4" w:space="0" w:color="000000"/>
@@ -3508,7 +3436,7 @@
         </w:tc>
         <w:tc>
           <w:tcPr>
-            <w:tcW w:w="1595" w:type="dxa"/>
+            <w:tcW w:w="1596" w:type="dxa"/>
             <w:tcBorders>
               <w:top w:val="single" w:sz="4" w:space="0" w:color="000000"/>
               <w:left w:val="single" w:sz="4" w:space="0" w:color="000000"/>
@@ -3996,7 +3924,7 @@
         </w:tc>
         <w:tc>
           <w:tcPr>
-            <w:tcW w:w="1546" w:type="dxa"/>
+            <w:tcW w:w="1545" w:type="dxa"/>
             <w:tcBorders>
               <w:top w:val="single" w:sz="4" w:space="0" w:color="000000"/>
               <w:left w:val="single" w:sz="4" w:space="0" w:color="000000"/>
@@ -4129,7 +4057,7 @@
         </w:tc>
         <w:tc>
           <w:tcPr>
-            <w:tcW w:w="1595" w:type="dxa"/>
+            <w:tcW w:w="1596" w:type="dxa"/>
             <w:tcBorders>
               <w:top w:val="single" w:sz="4" w:space="0" w:color="000000"/>
               <w:left w:val="single" w:sz="4" w:space="0" w:color="000000"/>
@@ -4617,7 +4545,7 @@
         </w:tc>
         <w:tc>
           <w:tcPr>
-            <w:tcW w:w="1546" w:type="dxa"/>
+            <w:tcW w:w="1545" w:type="dxa"/>
             <w:tcBorders>
               <w:top w:val="single" w:sz="4" w:space="0" w:color="000000"/>
               <w:left w:val="single" w:sz="4" w:space="0" w:color="000000"/>
@@ -4750,7 +4678,7 @@
         </w:tc>
         <w:tc>
           <w:tcPr>
-            <w:tcW w:w="1595" w:type="dxa"/>
+            <w:tcW w:w="1596" w:type="dxa"/>
             <w:tcBorders>
               <w:top w:val="single" w:sz="4" w:space="0" w:color="000000"/>
               <w:left w:val="single" w:sz="4" w:space="0" w:color="000000"/>
@@ -5238,7 +5166,7 @@
         </w:tc>
         <w:tc>
           <w:tcPr>
-            <w:tcW w:w="1546" w:type="dxa"/>
+            <w:tcW w:w="1545" w:type="dxa"/>
             <w:tcBorders>
               <w:top w:val="single" w:sz="4" w:space="0" w:color="000000"/>
               <w:left w:val="single" w:sz="4" w:space="0" w:color="000000"/>
@@ -5371,7 +5299,7 @@
         </w:tc>
         <w:tc>
           <w:tcPr>
-            <w:tcW w:w="1595" w:type="dxa"/>
+            <w:tcW w:w="1596" w:type="dxa"/>
             <w:tcBorders>
               <w:top w:val="single" w:sz="4" w:space="0" w:color="000000"/>
               <w:left w:val="single" w:sz="4" w:space="0" w:color="000000"/>
@@ -5859,7 +5787,7 @@
         </w:tc>
         <w:tc>
           <w:tcPr>
-            <w:tcW w:w="1546" w:type="dxa"/>
+            <w:tcW w:w="1545" w:type="dxa"/>
             <w:tcBorders>
               <w:top w:val="single" w:sz="4" w:space="0" w:color="000000"/>
               <w:left w:val="single" w:sz="4" w:space="0" w:color="000000"/>
@@ -5992,7 +5920,7 @@
         </w:tc>
         <w:tc>
           <w:tcPr>
-            <w:tcW w:w="1595" w:type="dxa"/>
+            <w:tcW w:w="1596" w:type="dxa"/>
             <w:tcBorders>
               <w:top w:val="single" w:sz="4" w:space="0" w:color="000000"/>
               <w:left w:val="single" w:sz="4" w:space="0" w:color="000000"/>
@@ -6463,7 +6391,7 @@
         </w:tc>
         <w:tc>
           <w:tcPr>
-            <w:tcW w:w="1546" w:type="dxa"/>
+            <w:tcW w:w="1545" w:type="dxa"/>
             <w:tcBorders>
               <w:top w:val="single" w:sz="4" w:space="0" w:color="000000"/>
               <w:left w:val="single" w:sz="4" w:space="0" w:color="000000"/>
@@ -6596,7 +6524,7 @@
         </w:tc>
         <w:tc>
           <w:tcPr>
-            <w:tcW w:w="1595" w:type="dxa"/>
+            <w:tcW w:w="1596" w:type="dxa"/>
             <w:tcBorders>
               <w:top w:val="single" w:sz="4" w:space="0" w:color="000000"/>
               <w:left w:val="single" w:sz="4" w:space="0" w:color="000000"/>
@@ -7092,7 +7020,7 @@
         </w:tc>
         <w:tc>
           <w:tcPr>
-            <w:tcW w:w="1546" w:type="dxa"/>
+            <w:tcW w:w="1545" w:type="dxa"/>
             <w:tcBorders>
               <w:top w:val="single" w:sz="4" w:space="0" w:color="000000"/>
               <w:left w:val="single" w:sz="4" w:space="0" w:color="000000"/>
@@ -7225,7 +7153,7 @@
         </w:tc>
         <w:tc>
           <w:tcPr>
-            <w:tcW w:w="1595" w:type="dxa"/>
+            <w:tcW w:w="1596" w:type="dxa"/>
             <w:tcBorders>
               <w:top w:val="single" w:sz="4" w:space="0" w:color="000000"/>
               <w:left w:val="single" w:sz="4" w:space="0" w:color="000000"/>
@@ -7713,7 +7641,7 @@
         </w:tc>
         <w:tc>
           <w:tcPr>
-            <w:tcW w:w="1546" w:type="dxa"/>
+            <w:tcW w:w="1545" w:type="dxa"/>
             <w:tcBorders>
               <w:top w:val="single" w:sz="4" w:space="0" w:color="000000"/>
               <w:left w:val="single" w:sz="4" w:space="0" w:color="000000"/>
@@ -7846,7 +7774,7 @@
         </w:tc>
         <w:tc>
           <w:tcPr>
-            <w:tcW w:w="1595" w:type="dxa"/>
+            <w:tcW w:w="1596" w:type="dxa"/>
             <w:tcBorders>
               <w:top w:val="single" w:sz="4" w:space="0" w:color="000000"/>
               <w:left w:val="single" w:sz="4" w:space="0" w:color="000000"/>
@@ -8334,7 +8262,7 @@
         </w:tc>
         <w:tc>
           <w:tcPr>
-            <w:tcW w:w="1546" w:type="dxa"/>
+            <w:tcW w:w="1545" w:type="dxa"/>
             <w:tcBorders>
               <w:top w:val="single" w:sz="4" w:space="0" w:color="000000"/>
               <w:left w:val="single" w:sz="4" w:space="0" w:color="000000"/>
@@ -8467,7 +8395,7 @@
         </w:tc>
         <w:tc>
           <w:tcPr>
-            <w:tcW w:w="1595" w:type="dxa"/>
+            <w:tcW w:w="1596" w:type="dxa"/>
             <w:tcBorders>
               <w:top w:val="single" w:sz="4" w:space="0" w:color="000000"/>
               <w:left w:val="single" w:sz="4" w:space="0" w:color="000000"/>
@@ -8989,7 +8917,7 @@
         </w:tc>
         <w:tc>
           <w:tcPr>
-            <w:tcW w:w="1546" w:type="dxa"/>
+            <w:tcW w:w="1545" w:type="dxa"/>
             <w:tcBorders>
               <w:top w:val="single" w:sz="4" w:space="0" w:color="000000"/>
               <w:left w:val="single" w:sz="4" w:space="0" w:color="000000"/>
@@ -9122,7 +9050,7 @@
         </w:tc>
         <w:tc>
           <w:tcPr>
-            <w:tcW w:w="1595" w:type="dxa"/>
+            <w:tcW w:w="1596" w:type="dxa"/>
             <w:tcBorders>
               <w:top w:val="single" w:sz="4" w:space="0" w:color="000000"/>
               <w:left w:val="single" w:sz="4" w:space="0" w:color="000000"/>
@@ -9593,7 +9521,7 @@
         </w:tc>
         <w:tc>
           <w:tcPr>
-            <w:tcW w:w="1546" w:type="dxa"/>
+            <w:tcW w:w="1545" w:type="dxa"/>
             <w:tcBorders>
               <w:top w:val="single" w:sz="4" w:space="0" w:color="000000"/>
               <w:left w:val="single" w:sz="4" w:space="0" w:color="000000"/>
@@ -9726,7 +9654,7 @@
         </w:tc>
         <w:tc>
           <w:tcPr>
-            <w:tcW w:w="1595" w:type="dxa"/>
+            <w:tcW w:w="1596" w:type="dxa"/>
             <w:tcBorders>
               <w:top w:val="single" w:sz="4" w:space="0" w:color="000000"/>
               <w:left w:val="single" w:sz="4" w:space="0" w:color="000000"/>
@@ -10214,7 +10142,7 @@
         </w:tc>
         <w:tc>
           <w:tcPr>
-            <w:tcW w:w="1546" w:type="dxa"/>
+            <w:tcW w:w="1545" w:type="dxa"/>
             <w:tcBorders>
               <w:top w:val="single" w:sz="4" w:space="0" w:color="000000"/>
               <w:left w:val="single" w:sz="4" w:space="0" w:color="000000"/>
@@ -10347,7 +10275,7 @@
         </w:tc>
         <w:tc>
           <w:tcPr>
-            <w:tcW w:w="1595" w:type="dxa"/>
+            <w:tcW w:w="1596" w:type="dxa"/>
             <w:tcBorders>
               <w:top w:val="single" w:sz="4" w:space="0" w:color="000000"/>
               <w:left w:val="single" w:sz="4" w:space="0" w:color="000000"/>
@@ -10843,7 +10771,7 @@
         </w:tc>
         <w:tc>
           <w:tcPr>
-            <w:tcW w:w="1546" w:type="dxa"/>
+            <w:tcW w:w="1545" w:type="dxa"/>
             <w:tcBorders>
               <w:top w:val="single" w:sz="4" w:space="0" w:color="000000"/>
               <w:left w:val="single" w:sz="4" w:space="0" w:color="000000"/>
@@ -10976,7 +10904,7 @@
         </w:tc>
         <w:tc>
           <w:tcPr>
-            <w:tcW w:w="1595" w:type="dxa"/>
+            <w:tcW w:w="1596" w:type="dxa"/>
             <w:tcBorders>
               <w:top w:val="single" w:sz="4" w:space="0" w:color="000000"/>
               <w:left w:val="single" w:sz="4" w:space="0" w:color="000000"/>
@@ -11447,7 +11375,7 @@
         </w:tc>
         <w:tc>
           <w:tcPr>
-            <w:tcW w:w="1546" w:type="dxa"/>
+            <w:tcW w:w="1545" w:type="dxa"/>
             <w:tcBorders>
               <w:top w:val="single" w:sz="4" w:space="0" w:color="000000"/>
               <w:left w:val="single" w:sz="4" w:space="0" w:color="000000"/>
@@ -11580,7 +11508,7 @@
         </w:tc>
         <w:tc>
           <w:tcPr>
-            <w:tcW w:w="1595" w:type="dxa"/>
+            <w:tcW w:w="1596" w:type="dxa"/>
             <w:tcBorders>
               <w:top w:val="single" w:sz="4" w:space="0" w:color="000000"/>
               <w:left w:val="single" w:sz="4" w:space="0" w:color="000000"/>
@@ -12068,7 +11996,7 @@
         </w:tc>
         <w:tc>
           <w:tcPr>
-            <w:tcW w:w="1546" w:type="dxa"/>
+            <w:tcW w:w="1545" w:type="dxa"/>
             <w:tcBorders>
               <w:top w:val="single" w:sz="4" w:space="0" w:color="000000"/>
               <w:left w:val="single" w:sz="4" w:space="0" w:color="000000"/>
@@ -12201,7 +12129,7 @@
         </w:tc>
         <w:tc>
           <w:tcPr>
-            <w:tcW w:w="1595" w:type="dxa"/>
+            <w:tcW w:w="1596" w:type="dxa"/>
             <w:tcBorders>
               <w:top w:val="single" w:sz="4" w:space="0" w:color="000000"/>
               <w:left w:val="single" w:sz="4" w:space="0" w:color="000000"/>
@@ -12778,8 +12706,8 @@
       <w:lang w:val="pt-PT" w:eastAsia="en-US" w:bidi="ar-SA"/>
     </w:rPr>
   </w:style>
-  <w:style w:type="paragraph" w:styleId="Contedodatabela">
-    <w:name w:val="Conteúdo da tabela"/>
+  <w:style w:type="paragraph" w:styleId="Contedodatabelauser">
+    <w:name w:val="Conteúdo da tabela (user)"/>
     <w:basedOn w:val="Normal"/>
     <w:qFormat/>
     <w:pPr>
@@ -12788,8 +12716,8 @@
     </w:pPr>
     <w:rPr/>
   </w:style>
-  <w:style w:type="numbering" w:styleId="Semlistauser" w:default="1">
-    <w:name w:val="Sem lista (user)"/>
+  <w:style w:type="numbering" w:styleId="Semlista" w:default="1">
+    <w:name w:val="Sem lista"/>
     <w:uiPriority w:val="99"/>
     <w:semiHidden/>
     <w:unhideWhenUsed/>

</xml_diff>

<commit_message>
feat:ASSINATURAS COM LINHAS MENOS TRAÇADAS E AJUSTE NO TEMPLATE..
</commit_message>
<xml_diff>
--- a/relatorios_semob/src/main/resources/templates/template_relatorio.docx
+++ b/relatorios_semob/src/main/resources/templates/template_relatorio.docx
@@ -1495,9 +1495,9 @@
                                   <a:avLst/>
                                   <a:gdLst>
                                     <a:gd name="textAreaLeft" fmla="*/ 0 w 16920"/>
-                                    <a:gd name="textAreaRight" fmla="*/ 21600 w 16920"/>
+                                    <a:gd name="textAreaRight" fmla="*/ 21960 w 16920"/>
                                     <a:gd name="textAreaTop" fmla="*/ 0 h 5040"/>
-                                    <a:gd name="textAreaBottom" fmla="*/ 9720 h 5040"/>
+                                    <a:gd name="textAreaBottom" fmla="*/ 10080 h 5040"/>
                                   </a:gdLst>
                                   <a:ahLst/>
                                   <a:cxnLst/>
@@ -1722,7 +1722,7 @@
       </w:tr>
       <w:tr>
         <w:trPr>
-          <w:trHeight w:val="4190" w:hRule="atLeast"/>
+          <w:trHeight w:val="3500" w:hRule="atLeast"/>
         </w:trPr>
         <w:tc>
           <w:tcPr>
@@ -1907,9 +1907,12 @@
       <w:pPr>
         <w:pStyle w:val="BodyText"/>
         <w:spacing w:before="221" w:after="0"/>
-        <w:ind w:left="144" w:right="2"/>
+        <w:ind w:hanging="0" w:left="0" w:right="2"/>
         <w:jc w:val="center"/>
-        <w:rPr/>
+        <w:rPr>
+          <w:b w:val="false"/>
+          <w:bCs w:val="false"/>
+        </w:rPr>
         <w:sectPr>
           <w:type w:val="nextPage"/>
           <w:pgSz w:w="11906" w:h="16838"/>
@@ -1965,8 +1968,8 @@
         <w:gridCol w:w="1803"/>
         <w:gridCol w:w="2113"/>
         <w:gridCol w:w="100"/>
-        <w:gridCol w:w="1545"/>
-        <w:gridCol w:w="1596"/>
+        <w:gridCol w:w="1544"/>
+        <w:gridCol w:w="1597"/>
       </w:tblGrid>
       <w:tr>
         <w:trPr>
@@ -2821,7 +2824,7 @@
         </w:tc>
         <w:tc>
           <w:tcPr>
-            <w:tcW w:w="1545" w:type="dxa"/>
+            <w:tcW w:w="1544" w:type="dxa"/>
             <w:tcBorders>
               <w:top w:val="single" w:sz="4" w:space="0" w:color="000000"/>
               <w:left w:val="single" w:sz="4" w:space="0" w:color="000000"/>
@@ -2872,7 +2875,7 @@
         </w:tc>
         <w:tc>
           <w:tcPr>
-            <w:tcW w:w="1596" w:type="dxa"/>
+            <w:tcW w:w="1597" w:type="dxa"/>
             <w:tcBorders>
               <w:top w:val="single" w:sz="4" w:space="0" w:color="000000"/>
               <w:left w:val="single" w:sz="4" w:space="0" w:color="000000"/>
@@ -3303,7 +3306,7 @@
         </w:tc>
         <w:tc>
           <w:tcPr>
-            <w:tcW w:w="1545" w:type="dxa"/>
+            <w:tcW w:w="1544" w:type="dxa"/>
             <w:tcBorders>
               <w:top w:val="single" w:sz="4" w:space="0" w:color="000000"/>
               <w:left w:val="single" w:sz="4" w:space="0" w:color="000000"/>
@@ -3436,7 +3439,7 @@
         </w:tc>
         <w:tc>
           <w:tcPr>
-            <w:tcW w:w="1596" w:type="dxa"/>
+            <w:tcW w:w="1597" w:type="dxa"/>
             <w:tcBorders>
               <w:top w:val="single" w:sz="4" w:space="0" w:color="000000"/>
               <w:left w:val="single" w:sz="4" w:space="0" w:color="000000"/>
@@ -3924,7 +3927,7 @@
         </w:tc>
         <w:tc>
           <w:tcPr>
-            <w:tcW w:w="1545" w:type="dxa"/>
+            <w:tcW w:w="1544" w:type="dxa"/>
             <w:tcBorders>
               <w:top w:val="single" w:sz="4" w:space="0" w:color="000000"/>
               <w:left w:val="single" w:sz="4" w:space="0" w:color="000000"/>
@@ -4057,7 +4060,7 @@
         </w:tc>
         <w:tc>
           <w:tcPr>
-            <w:tcW w:w="1596" w:type="dxa"/>
+            <w:tcW w:w="1597" w:type="dxa"/>
             <w:tcBorders>
               <w:top w:val="single" w:sz="4" w:space="0" w:color="000000"/>
               <w:left w:val="single" w:sz="4" w:space="0" w:color="000000"/>
@@ -4545,7 +4548,7 @@
         </w:tc>
         <w:tc>
           <w:tcPr>
-            <w:tcW w:w="1545" w:type="dxa"/>
+            <w:tcW w:w="1544" w:type="dxa"/>
             <w:tcBorders>
               <w:top w:val="single" w:sz="4" w:space="0" w:color="000000"/>
               <w:left w:val="single" w:sz="4" w:space="0" w:color="000000"/>
@@ -4678,7 +4681,7 @@
         </w:tc>
         <w:tc>
           <w:tcPr>
-            <w:tcW w:w="1596" w:type="dxa"/>
+            <w:tcW w:w="1597" w:type="dxa"/>
             <w:tcBorders>
               <w:top w:val="single" w:sz="4" w:space="0" w:color="000000"/>
               <w:left w:val="single" w:sz="4" w:space="0" w:color="000000"/>
@@ -5166,7 +5169,7 @@
         </w:tc>
         <w:tc>
           <w:tcPr>
-            <w:tcW w:w="1545" w:type="dxa"/>
+            <w:tcW w:w="1544" w:type="dxa"/>
             <w:tcBorders>
               <w:top w:val="single" w:sz="4" w:space="0" w:color="000000"/>
               <w:left w:val="single" w:sz="4" w:space="0" w:color="000000"/>
@@ -5299,7 +5302,7 @@
         </w:tc>
         <w:tc>
           <w:tcPr>
-            <w:tcW w:w="1596" w:type="dxa"/>
+            <w:tcW w:w="1597" w:type="dxa"/>
             <w:tcBorders>
               <w:top w:val="single" w:sz="4" w:space="0" w:color="000000"/>
               <w:left w:val="single" w:sz="4" w:space="0" w:color="000000"/>
@@ -5787,7 +5790,7 @@
         </w:tc>
         <w:tc>
           <w:tcPr>
-            <w:tcW w:w="1545" w:type="dxa"/>
+            <w:tcW w:w="1544" w:type="dxa"/>
             <w:tcBorders>
               <w:top w:val="single" w:sz="4" w:space="0" w:color="000000"/>
               <w:left w:val="single" w:sz="4" w:space="0" w:color="000000"/>
@@ -5920,7 +5923,7 @@
         </w:tc>
         <w:tc>
           <w:tcPr>
-            <w:tcW w:w="1596" w:type="dxa"/>
+            <w:tcW w:w="1597" w:type="dxa"/>
             <w:tcBorders>
               <w:top w:val="single" w:sz="4" w:space="0" w:color="000000"/>
               <w:left w:val="single" w:sz="4" w:space="0" w:color="000000"/>
@@ -6391,7 +6394,7 @@
         </w:tc>
         <w:tc>
           <w:tcPr>
-            <w:tcW w:w="1545" w:type="dxa"/>
+            <w:tcW w:w="1544" w:type="dxa"/>
             <w:tcBorders>
               <w:top w:val="single" w:sz="4" w:space="0" w:color="000000"/>
               <w:left w:val="single" w:sz="4" w:space="0" w:color="000000"/>
@@ -6524,7 +6527,7 @@
         </w:tc>
         <w:tc>
           <w:tcPr>
-            <w:tcW w:w="1596" w:type="dxa"/>
+            <w:tcW w:w="1597" w:type="dxa"/>
             <w:tcBorders>
               <w:top w:val="single" w:sz="4" w:space="0" w:color="000000"/>
               <w:left w:val="single" w:sz="4" w:space="0" w:color="000000"/>
@@ -7020,7 +7023,7 @@
         </w:tc>
         <w:tc>
           <w:tcPr>
-            <w:tcW w:w="1545" w:type="dxa"/>
+            <w:tcW w:w="1544" w:type="dxa"/>
             <w:tcBorders>
               <w:top w:val="single" w:sz="4" w:space="0" w:color="000000"/>
               <w:left w:val="single" w:sz="4" w:space="0" w:color="000000"/>
@@ -7153,7 +7156,7 @@
         </w:tc>
         <w:tc>
           <w:tcPr>
-            <w:tcW w:w="1596" w:type="dxa"/>
+            <w:tcW w:w="1597" w:type="dxa"/>
             <w:tcBorders>
               <w:top w:val="single" w:sz="4" w:space="0" w:color="000000"/>
               <w:left w:val="single" w:sz="4" w:space="0" w:color="000000"/>
@@ -7641,7 +7644,7 @@
         </w:tc>
         <w:tc>
           <w:tcPr>
-            <w:tcW w:w="1545" w:type="dxa"/>
+            <w:tcW w:w="1544" w:type="dxa"/>
             <w:tcBorders>
               <w:top w:val="single" w:sz="4" w:space="0" w:color="000000"/>
               <w:left w:val="single" w:sz="4" w:space="0" w:color="000000"/>
@@ -7774,7 +7777,7 @@
         </w:tc>
         <w:tc>
           <w:tcPr>
-            <w:tcW w:w="1596" w:type="dxa"/>
+            <w:tcW w:w="1597" w:type="dxa"/>
             <w:tcBorders>
               <w:top w:val="single" w:sz="4" w:space="0" w:color="000000"/>
               <w:left w:val="single" w:sz="4" w:space="0" w:color="000000"/>
@@ -8262,7 +8265,7 @@
         </w:tc>
         <w:tc>
           <w:tcPr>
-            <w:tcW w:w="1545" w:type="dxa"/>
+            <w:tcW w:w="1544" w:type="dxa"/>
             <w:tcBorders>
               <w:top w:val="single" w:sz="4" w:space="0" w:color="000000"/>
               <w:left w:val="single" w:sz="4" w:space="0" w:color="000000"/>
@@ -8395,7 +8398,7 @@
         </w:tc>
         <w:tc>
           <w:tcPr>
-            <w:tcW w:w="1596" w:type="dxa"/>
+            <w:tcW w:w="1597" w:type="dxa"/>
             <w:tcBorders>
               <w:top w:val="single" w:sz="4" w:space="0" w:color="000000"/>
               <w:left w:val="single" w:sz="4" w:space="0" w:color="000000"/>
@@ -8917,7 +8920,7 @@
         </w:tc>
         <w:tc>
           <w:tcPr>
-            <w:tcW w:w="1545" w:type="dxa"/>
+            <w:tcW w:w="1544" w:type="dxa"/>
             <w:tcBorders>
               <w:top w:val="single" w:sz="4" w:space="0" w:color="000000"/>
               <w:left w:val="single" w:sz="4" w:space="0" w:color="000000"/>
@@ -9050,7 +9053,7 @@
         </w:tc>
         <w:tc>
           <w:tcPr>
-            <w:tcW w:w="1596" w:type="dxa"/>
+            <w:tcW w:w="1597" w:type="dxa"/>
             <w:tcBorders>
               <w:top w:val="single" w:sz="4" w:space="0" w:color="000000"/>
               <w:left w:val="single" w:sz="4" w:space="0" w:color="000000"/>
@@ -9521,7 +9524,7 @@
         </w:tc>
         <w:tc>
           <w:tcPr>
-            <w:tcW w:w="1545" w:type="dxa"/>
+            <w:tcW w:w="1544" w:type="dxa"/>
             <w:tcBorders>
               <w:top w:val="single" w:sz="4" w:space="0" w:color="000000"/>
               <w:left w:val="single" w:sz="4" w:space="0" w:color="000000"/>
@@ -9654,7 +9657,7 @@
         </w:tc>
         <w:tc>
           <w:tcPr>
-            <w:tcW w:w="1596" w:type="dxa"/>
+            <w:tcW w:w="1597" w:type="dxa"/>
             <w:tcBorders>
               <w:top w:val="single" w:sz="4" w:space="0" w:color="000000"/>
               <w:left w:val="single" w:sz="4" w:space="0" w:color="000000"/>
@@ -10142,7 +10145,7 @@
         </w:tc>
         <w:tc>
           <w:tcPr>
-            <w:tcW w:w="1545" w:type="dxa"/>
+            <w:tcW w:w="1544" w:type="dxa"/>
             <w:tcBorders>
               <w:top w:val="single" w:sz="4" w:space="0" w:color="000000"/>
               <w:left w:val="single" w:sz="4" w:space="0" w:color="000000"/>
@@ -10275,7 +10278,7 @@
         </w:tc>
         <w:tc>
           <w:tcPr>
-            <w:tcW w:w="1596" w:type="dxa"/>
+            <w:tcW w:w="1597" w:type="dxa"/>
             <w:tcBorders>
               <w:top w:val="single" w:sz="4" w:space="0" w:color="000000"/>
               <w:left w:val="single" w:sz="4" w:space="0" w:color="000000"/>
@@ -10771,7 +10774,7 @@
         </w:tc>
         <w:tc>
           <w:tcPr>
-            <w:tcW w:w="1545" w:type="dxa"/>
+            <w:tcW w:w="1544" w:type="dxa"/>
             <w:tcBorders>
               <w:top w:val="single" w:sz="4" w:space="0" w:color="000000"/>
               <w:left w:val="single" w:sz="4" w:space="0" w:color="000000"/>
@@ -10904,7 +10907,7 @@
         </w:tc>
         <w:tc>
           <w:tcPr>
-            <w:tcW w:w="1596" w:type="dxa"/>
+            <w:tcW w:w="1597" w:type="dxa"/>
             <w:tcBorders>
               <w:top w:val="single" w:sz="4" w:space="0" w:color="000000"/>
               <w:left w:val="single" w:sz="4" w:space="0" w:color="000000"/>
@@ -11375,7 +11378,7 @@
         </w:tc>
         <w:tc>
           <w:tcPr>
-            <w:tcW w:w="1545" w:type="dxa"/>
+            <w:tcW w:w="1544" w:type="dxa"/>
             <w:tcBorders>
               <w:top w:val="single" w:sz="4" w:space="0" w:color="000000"/>
               <w:left w:val="single" w:sz="4" w:space="0" w:color="000000"/>
@@ -11508,7 +11511,7 @@
         </w:tc>
         <w:tc>
           <w:tcPr>
-            <w:tcW w:w="1596" w:type="dxa"/>
+            <w:tcW w:w="1597" w:type="dxa"/>
             <w:tcBorders>
               <w:top w:val="single" w:sz="4" w:space="0" w:color="000000"/>
               <w:left w:val="single" w:sz="4" w:space="0" w:color="000000"/>
@@ -11996,7 +11999,7 @@
         </w:tc>
         <w:tc>
           <w:tcPr>
-            <w:tcW w:w="1545" w:type="dxa"/>
+            <w:tcW w:w="1544" w:type="dxa"/>
             <w:tcBorders>
               <w:top w:val="single" w:sz="4" w:space="0" w:color="000000"/>
               <w:left w:val="single" w:sz="4" w:space="0" w:color="000000"/>
@@ -12129,7 +12132,7 @@
         </w:tc>
         <w:tc>
           <w:tcPr>
-            <w:tcW w:w="1596" w:type="dxa"/>
+            <w:tcW w:w="1597" w:type="dxa"/>
             <w:tcBorders>
               <w:top w:val="single" w:sz="4" w:space="0" w:color="000000"/>
               <w:left w:val="single" w:sz="4" w:space="0" w:color="000000"/>
@@ -12706,8 +12709,8 @@
       <w:lang w:val="pt-PT" w:eastAsia="en-US" w:bidi="ar-SA"/>
     </w:rPr>
   </w:style>
-  <w:style w:type="paragraph" w:styleId="Contedodatabelauser">
-    <w:name w:val="Conteúdo da tabela (user)"/>
+  <w:style w:type="paragraph" w:styleId="Contedodatabela">
+    <w:name w:val="Conteúdo da tabela"/>
     <w:basedOn w:val="Normal"/>
     <w:qFormat/>
     <w:pPr>
@@ -12716,8 +12719,8 @@
     </w:pPr>
     <w:rPr/>
   </w:style>
-  <w:style w:type="numbering" w:styleId="Semlista" w:default="1">
-    <w:name w:val="Sem lista"/>
+  <w:style w:type="numbering" w:styleId="Semlistauser" w:default="1">
+    <w:name w:val="Sem lista (user)"/>
     <w:uiPriority w:val="99"/>
     <w:semiHidden/>
     <w:unhideWhenUsed/>

</xml_diff>